<commit_message>
Finalize negotiation courseware v8 visual QA
</commit_message>
<xml_diff>
--- a/courseware/LG-Unlocking Business Potential with Strategic Negotiation Tactics.docx
+++ b/courseware/LG-Unlocking Business Potential with Strategic Negotiation Tactics.docx
@@ -361,345 +361,12 @@
       </w:r>
     </w:p>
     <w:p>
-      <w:pPr>
-        <w:tabs>
-          <w:tab w:pos="9072" w:val="right" w:leader="dot"/>
-        </w:tabs>
-        <w:spacing w:after="60"/>
-      </w:pPr>
-      <w:r>
-        <w:rPr>
-          <w:rFonts w:ascii="Arial" w:hAnsi="Arial"/>
-          <w:b/>
-          <w:color w:val="333333"/>
-          <w:sz w:val="22"/>
-        </w:rPr>
-        <w:t>How to Use This Guide</w:t>
-        <w:tab/>
-        <w:t>4</w:t>
-      </w:r>
-    </w:p>
-    <w:p>
-      <w:pPr>
-        <w:tabs>
-          <w:tab w:pos="9072" w:val="right" w:leader="dot"/>
-        </w:tabs>
-        <w:spacing w:after="60"/>
-      </w:pPr>
-      <w:r>
-        <w:rPr>
-          <w:rFonts w:ascii="Arial" w:hAnsi="Arial"/>
-          <w:b/>
-          <w:color w:val="333333"/>
-          <w:sz w:val="22"/>
-        </w:rPr>
-        <w:t>Course Learning Outcomes and TSC Mapping</w:t>
-        <w:tab/>
-        <w:t>4</w:t>
-      </w:r>
-    </w:p>
-    <w:p>
-      <w:pPr>
-        <w:tabs>
-          <w:tab w:pos="9072" w:val="right" w:leader="dot"/>
-        </w:tabs>
-        <w:spacing w:after="60"/>
-      </w:pPr>
-      <w:r>
-        <w:rPr>
-          <w:rFonts w:ascii="Arial" w:hAnsi="Arial"/>
-          <w:b/>
-          <w:color w:val="333333"/>
-          <w:sz w:val="22"/>
-        </w:rPr>
-        <w:t>The Real-World Activity Portfolio</w:t>
-        <w:tab/>
-        <w:t>4</w:t>
-      </w:r>
-    </w:p>
-    <w:p>
-      <w:pPr>
-        <w:tabs>
-          <w:tab w:pos="9072" w:val="right" w:leader="dot"/>
-        </w:tabs>
-        <w:spacing w:after="60"/>
-      </w:pPr>
-      <w:r>
-        <w:rPr>
-          <w:rFonts w:ascii="Arial" w:hAnsi="Arial"/>
-          <w:b/>
-          <w:color w:val="333333"/>
-          <w:sz w:val="22"/>
-        </w:rPr>
-        <w:t>Topic 1 — Preparation for Negotiation</w:t>
-        <w:tab/>
-        <w:t>5</w:t>
-      </w:r>
-    </w:p>
-    <w:p>
-      <w:pPr>
-        <w:tabs>
-          <w:tab w:pos="9072" w:val="right" w:leader="dot"/>
-        </w:tabs>
-        <w:spacing w:after="60"/>
-      </w:pPr>
-      <w:r>
-        <w:rPr>
-          <w:rFonts w:ascii="Arial" w:hAnsi="Arial"/>
-          <w:b/>
-          <w:color w:val="333333"/>
-          <w:sz w:val="22"/>
-        </w:rPr>
-        <w:t>Activity 1 — Renew a Critical Ingredient Supply Agreement</w:t>
-        <w:tab/>
-        <w:t>8</w:t>
-      </w:r>
-    </w:p>
-    <w:p>
-      <w:pPr>
-        <w:tabs>
-          <w:tab w:pos="9072" w:val="right" w:leader="dot"/>
-        </w:tabs>
-        <w:spacing w:after="60"/>
-      </w:pPr>
-      <w:r>
-        <w:rPr>
-          <w:rFonts w:ascii="Arial" w:hAnsi="Arial"/>
-          <w:b/>
-          <w:color w:val="333333"/>
-          <w:sz w:val="22"/>
-        </w:rPr>
-        <w:t>Activity 2 — Create a SaaS Renewal Team Mandate</w:t>
-        <w:tab/>
-        <w:t>10</w:t>
-      </w:r>
-    </w:p>
-    <w:p>
-      <w:pPr>
-        <w:tabs>
-          <w:tab w:pos="9072" w:val="right" w:leader="dot"/>
-        </w:tabs>
-        <w:spacing w:after="60"/>
-      </w:pPr>
-      <w:r>
-        <w:rPr>
-          <w:rFonts w:ascii="Arial" w:hAnsi="Arial"/>
-          <w:b/>
-          <w:color w:val="333333"/>
-          <w:sz w:val="22"/>
-        </w:rPr>
-        <w:t>Activity 3 — Prepare a Commercial Lease Renewal</w:t>
-        <w:tab/>
-        <w:t>12</w:t>
-      </w:r>
-    </w:p>
-    <w:p>
-      <w:pPr>
-        <w:tabs>
-          <w:tab w:pos="9072" w:val="right" w:leader="dot"/>
-        </w:tabs>
-        <w:spacing w:after="60"/>
-      </w:pPr>
-      <w:r>
-        <w:rPr>
-          <w:rFonts w:ascii="Arial" w:hAnsi="Arial"/>
-          <w:b/>
-          <w:color w:val="333333"/>
-          <w:sz w:val="22"/>
-        </w:rPr>
-        <w:t>Activity 4 — Plan a Singapore–Japan Distribution Partnership</w:t>
-        <w:tab/>
-        <w:t>13</w:t>
-      </w:r>
-    </w:p>
-    <w:p>
-      <w:pPr>
-        <w:tabs>
-          <w:tab w:pos="9072" w:val="right" w:leader="dot"/>
-        </w:tabs>
-        <w:spacing w:after="60"/>
-      </w:pPr>
-      <w:r>
-        <w:rPr>
-          <w:rFonts w:ascii="Arial" w:hAnsi="Arial"/>
-          <w:b/>
-          <w:color w:val="333333"/>
-          <w:sz w:val="22"/>
-        </w:rPr>
-        <w:t>Activity 5 — Design a Total-Reward Job Offer Negotiation</w:t>
-        <w:tab/>
-        <w:t>15</w:t>
-      </w:r>
-    </w:p>
-    <w:p>
-      <w:pPr>
-        <w:tabs>
-          <w:tab w:pos="9072" w:val="right" w:leader="dot"/>
-        </w:tabs>
-        <w:spacing w:after="60"/>
-      </w:pPr>
-      <w:r>
-        <w:rPr>
-          <w:rFonts w:ascii="Arial" w:hAnsi="Arial"/>
-          <w:b/>
-          <w:color w:val="333333"/>
-          <w:sz w:val="22"/>
-        </w:rPr>
-        <w:t>Topic 2 — Negotiation Tactics</w:t>
-        <w:tab/>
-        <w:t>16</w:t>
-      </w:r>
-    </w:p>
-    <w:p>
-      <w:pPr>
-        <w:tabs>
-          <w:tab w:pos="9072" w:val="right" w:leader="dot"/>
-        </w:tabs>
-        <w:spacing w:after="60"/>
-      </w:pPr>
-      <w:r>
-        <w:rPr>
-          <w:rFonts w:ascii="Arial" w:hAnsi="Arial"/>
-          <w:b/>
-          <w:color w:val="333333"/>
-          <w:sz w:val="22"/>
-        </w:rPr>
-        <w:t>Activity 6 — Anchor and Frame an Agency Retainer</w:t>
-        <w:tab/>
-        <w:t>21</w:t>
-      </w:r>
-    </w:p>
-    <w:p>
-      <w:pPr>
-        <w:tabs>
-          <w:tab w:pos="9072" w:val="right" w:leader="dot"/>
-        </w:tabs>
-        <w:spacing w:after="60"/>
-      </w:pPr>
-      <w:r>
-        <w:rPr>
-          <w:rFonts w:ascii="Arial" w:hAnsi="Arial"/>
-          <w:b/>
-          <w:color w:val="333333"/>
-          <w:sz w:val="22"/>
-        </w:rPr>
-        <w:t>Activity 7 — Recover a Logistics Service Relationship</w:t>
-        <w:tab/>
-        <w:t>23</w:t>
-      </w:r>
-    </w:p>
-    <w:p>
-      <w:pPr>
-        <w:tabs>
-          <w:tab w:pos="9072" w:val="right" w:leader="dot"/>
-        </w:tabs>
-        <w:spacing w:after="60"/>
-      </w:pPr>
-      <w:r>
-        <w:rPr>
-          <w:rFonts w:ascii="Arial" w:hAnsi="Arial"/>
-          <w:b/>
-          <w:color w:val="333333"/>
-          <w:sz w:val="22"/>
-        </w:rPr>
-        <w:t>Activity 8 — Break a Construction Variation Impasse</w:t>
-        <w:tab/>
-        <w:t>24</w:t>
-      </w:r>
-    </w:p>
-    <w:p>
-      <w:pPr>
-        <w:tabs>
-          <w:tab w:pos="9072" w:val="right" w:leader="dot"/>
-        </w:tabs>
-        <w:spacing w:after="60"/>
-      </w:pPr>
-      <w:r>
-        <w:rPr>
-          <w:rFonts w:ascii="Arial" w:hAnsi="Arial"/>
-          <w:b/>
-          <w:color w:val="333333"/>
-          <w:sz w:val="22"/>
-        </w:rPr>
-        <w:t>Activity 9 — Negotiate a Multi-Party Growth Investment</w:t>
-        <w:tab/>
-        <w:t>26</w:t>
-      </w:r>
-    </w:p>
-    <w:p>
-      <w:pPr>
-        <w:tabs>
-          <w:tab w:pos="9072" w:val="right" w:leader="dot"/>
-        </w:tabs>
-        <w:spacing w:after="60"/>
-      </w:pPr>
-      <w:r>
-        <w:rPr>
-          <w:rFonts w:ascii="Arial" w:hAnsi="Arial"/>
-          <w:b/>
-          <w:color w:val="333333"/>
-          <w:sz w:val="22"/>
-        </w:rPr>
-        <w:t>Activity 10 — Run and Debrief a Strategic Sustainability Partnership</w:t>
-        <w:tab/>
-        <w:t>27</w:t>
-      </w:r>
-    </w:p>
-    <w:p>
-      <w:pPr>
-        <w:tabs>
-          <w:tab w:pos="9072" w:val="right" w:leader="dot"/>
-        </w:tabs>
-        <w:spacing w:after="60"/>
-      </w:pPr>
-      <w:r>
-        <w:rPr>
-          <w:rFonts w:ascii="Arial" w:hAnsi="Arial"/>
-          <w:b/>
-          <w:color w:val="333333"/>
-          <w:sz w:val="22"/>
-        </w:rPr>
-        <w:t>Assessment Preparation</w:t>
-        <w:tab/>
-        <w:t>29</w:t>
-      </w:r>
-    </w:p>
-    <w:p>
-      <w:pPr>
-        <w:tabs>
-          <w:tab w:pos="9072" w:val="right" w:leader="dot"/>
-        </w:tabs>
-        <w:spacing w:after="60"/>
-      </w:pPr>
-      <w:r>
-        <w:rPr>
-          <w:rFonts w:ascii="Arial" w:hAnsi="Arial"/>
-          <w:b/>
-          <w:color w:val="333333"/>
-          <w:sz w:val="22"/>
-        </w:rPr>
-        <w:t>Sources and Further Reading</w:t>
-        <w:tab/>
-        <w:t>29</w:t>
-      </w:r>
-    </w:p>
-    <w:p>
-      <w:pPr>
-        <w:tabs>
-          <w:tab w:pos="9072" w:val="right" w:leader="dot"/>
-        </w:tabs>
-        <w:spacing w:after="60"/>
-      </w:pPr>
-      <w:r>
-        <w:rPr>
-          <w:rFonts w:ascii="Arial" w:hAnsi="Arial"/>
-          <w:b/>
-          <w:color w:val="333333"/>
-          <w:sz w:val="22"/>
-        </w:rPr>
-        <w:t>Glossary</w:t>
-        <w:tab/>
-        <w:t>30</w:t>
+      <w:r>
+        <w:fldChar w:fldCharType="begin"/>
+        <w:instrText xml:space="preserve">TOC \o "1-3" \h \z \u</w:instrText>
+        <w:fldChar w:fldCharType="separate"/>
+        <w:t>Right-click and choose “Update Field”, or press F9, to build the table of contents.</w:t>
+        <w:fldChar w:fldCharType="end"/>
       </w:r>
     </w:p>
     <w:p>

</xml_diff>